<commit_message>
Minor adjustment made to script to ensure it gets saved to the proper folder, SWE template updated
</commit_message>
<xml_diff>
--- a/SWE_CoverLetterTemplate.docx
+++ b/SWE_CoverLetterTemplate.docx
@@ -725,7 +725,23 @@
           <w:sz w:val="19"/>
           <w:szCs w:val="19"/>
         </w:rPr>
-        <w:t xml:space="preserve"> As part of my ongoing learning journey, I am still familiarizing with other</w:t>
+        <w:t xml:space="preserve"> As part of my ongoing learning journey, I am still familiarizing</w:t>
+      </w:r>
+      <w:r>
+        <w:rPr>
+          <w:rFonts w:ascii="Calibri Light" w:hAnsi="Calibri Light" w:cs="Calibri Light"/>
+          <w:sz w:val="19"/>
+          <w:szCs w:val="19"/>
+        </w:rPr>
+        <w:t xml:space="preserve"> myself</w:t>
+      </w:r>
+      <w:r>
+        <w:rPr>
+          <w:rFonts w:ascii="Calibri Light" w:hAnsi="Calibri Light" w:cs="Calibri Light"/>
+          <w:sz w:val="19"/>
+          <w:szCs w:val="19"/>
+        </w:rPr>
+        <w:t xml:space="preserve"> with other</w:t>
       </w:r>
       <w:r>
         <w:rPr>
@@ -2346,6 +2362,7 @@
   <w:style w:type="character" w:default="1" w:styleId="DefaultParagraphFont">
     <w:name w:val="Default Paragraph Font"/>
     <w:uiPriority w:val="1"/>
+    <w:semiHidden/>
     <w:unhideWhenUsed/>
   </w:style>
   <w:style w:type="table" w:default="1" w:styleId="TableNormal">

</xml_diff>